<commit_message>
Upload “src/content/bios/Van der Stoel-M 2024.docx”
</commit_message>
<xml_diff>
--- a/src/content/bios/Van der Stoel-M 2024.docx
+++ b/src/content/bios/Van der Stoel-M 2024.docx
@@ -1,6 +1,6 @@
 
 <file path=word/document.xml><?xml version="1.0" encoding="utf-8"?>
-<w:document xmlns:wpc="http://schemas.microsoft.com/office/word/2010/wordprocessingCanvas" xmlns:cx="http://schemas.microsoft.com/office/drawing/2014/chartex" xmlns:cx1="http://schemas.microsoft.com/office/drawing/2015/9/8/chartex" xmlns:cx2="http://schemas.microsoft.com/office/drawing/2015/10/21/chartex" xmlns:cx3="http://schemas.microsoft.com/office/drawing/2016/5/9/chartex" xmlns:cx4="http://schemas.microsoft.com/office/drawing/2016/5/10/chartex" xmlns:cx5="http://schemas.microsoft.com/office/drawing/2016/5/11/chartex" xmlns:cx6="http://schemas.microsoft.com/office/drawing/2016/5/12/chartex" xmlns:cx7="http://schemas.microsoft.com/office/drawing/2016/5/13/chartex" xmlns:cx8="http://schemas.microsoft.com/office/drawing/2016/5/14/chartex" xmlns:mc="http://schemas.openxmlformats.org/markup-compatibility/2006" xmlns:aink="http://schemas.microsoft.com/office/drawing/2016/ink" xmlns:am3d="http://schemas.microsoft.com/office/drawing/2017/model3d" xmlns:o="urn:schemas-microsoft-com:office:office" xmlns:oel="http://schemas.microsoft.com/office/2019/extlst" xmlns:r="http://schemas.openxmlformats.org/officeDocument/2006/relationships" xmlns:m="http://schemas.openxmlformats.org/officeDocument/2006/math" xmlns:v="urn:schemas-microsoft-com:vml" xmlns:wp14="http://schemas.microsoft.com/office/word/2010/wordprocessingDrawing" xmlns:wp="http://schemas.openxmlformats.org/drawingml/2006/wordprocessingDrawing" xmlns:w10="urn:schemas-microsoft-com:office:word" xmlns:w="http://schemas.openxmlformats.org/wordprocessingml/2006/main" xmlns:w14="http://schemas.microsoft.com/office/word/2010/wordml" xmlns:w15="http://schemas.microsoft.com/office/word/2012/wordml" xmlns:w16cex="http://schemas.microsoft.com/office/word/2018/wordml/cex" xmlns:w16cid="http://schemas.microsoft.com/office/word/2016/wordml/cid" xmlns:w16="http://schemas.microsoft.com/office/word/2018/wordml" xmlns:w16du="http://schemas.microsoft.com/office/word/2023/wordml/word16du" xmlns:w16sdtdh="http://schemas.microsoft.com/office/word/2020/wordml/sdtdatahash" xmlns:w16sdtfl="http://schemas.microsoft.com/office/word/2024/wordml/sdtformatlock" xmlns:w16se="http://schemas.microsoft.com/office/word/2015/wordml/symex" xmlns:wpg="http://schemas.microsoft.com/office/word/2010/wordprocessingGroup" xmlns:wpi="http://schemas.microsoft.com/office/word/2010/wordprocessingInk" xmlns:wne="http://schemas.microsoft.com/office/word/2006/wordml" xmlns:wps="http://schemas.microsoft.com/office/word/2010/wordprocessingShape" mc:Ignorable="w14 w15 w16se w16cid w16 w16cex w16sdtdh w16sdtfl w16du wp14">
+<w:document xmlns:wpc="http://schemas.microsoft.com/office/word/2010/wordprocessingCanvas" xmlns:cx="http://schemas.microsoft.com/office/drawing/2014/chartex" xmlns:cx1="http://schemas.microsoft.com/office/drawing/2015/9/8/chartex" xmlns:cx2="http://schemas.microsoft.com/office/drawing/2015/10/21/chartex" xmlns:cx3="http://schemas.microsoft.com/office/drawing/2016/5/9/chartex" xmlns:cx4="http://schemas.microsoft.com/office/drawing/2016/5/10/chartex" xmlns:cx5="http://schemas.microsoft.com/office/drawing/2016/5/11/chartex" xmlns:cx6="http://schemas.microsoft.com/office/drawing/2016/5/12/chartex" xmlns:cx7="http://schemas.microsoft.com/office/drawing/2016/5/13/chartex" xmlns:cx8="http://schemas.microsoft.com/office/drawing/2016/5/14/chartex" xmlns:mc="http://schemas.openxmlformats.org/markup-compatibility/2006" xmlns:m="http://schemas.openxmlformats.org/officeDocument/2006/math" xmlns:aink="http://schemas.microsoft.com/office/drawing/2016/ink" xmlns:am3d="http://schemas.microsoft.com/office/drawing/2017/model3d" xmlns:oel="http://schemas.microsoft.com/office/2019/extlst" xmlns:r="http://schemas.openxmlformats.org/officeDocument/2006/relationships" xmlns:wp14="http://schemas.microsoft.com/office/word/2010/wordprocessingDrawing" xmlns:wp="http://schemas.openxmlformats.org/drawingml/2006/wordprocessingDrawing" xmlns:wpg="http://schemas.microsoft.com/office/word/2010/wordprocessingGroup" xmlns:wpi="http://schemas.microsoft.com/office/word/2010/wordprocessingInk" xmlns:wps="http://schemas.microsoft.com/office/word/2010/wordprocessingShape" xmlns:o="urn:schemas-microsoft-com:office:office" xmlns:v="urn:schemas-microsoft-com:vml" xmlns:w10="urn:schemas-microsoft-com:office:word" xmlns:w="http://schemas.openxmlformats.org/wordprocessingml/2006/main" xmlns:w14="http://schemas.microsoft.com/office/word/2010/wordml" xmlns:w15="http://schemas.microsoft.com/office/word/2012/wordml" xmlns:w16cei="http://schemas.microsoft.com/office/word/2026/wordml/cei" xmlns:w16cex="http://schemas.microsoft.com/office/word/2018/wordml/cex" xmlns:w16cid="http://schemas.microsoft.com/office/word/2016/wordml/cid" xmlns:w16="http://schemas.microsoft.com/office/word/2018/wordml" xmlns:w16sdtdh="http://schemas.microsoft.com/office/word/2020/wordml/sdtdatahash" xmlns:w16sdtfl="http://schemas.microsoft.com/office/word/2024/wordml/sdtformatlock" xmlns:w16se="http://schemas.microsoft.com/office/word/2015/wordml/symex" xmlns:w16du="http://schemas.microsoft.com/office/word/2023/wordml/word16du" xmlns:wne="http://schemas.microsoft.com/office/word/2006/wordml" mc:Ignorable="w14 w15 w16se w16cid w16 w16cex w16sdtdh w16sdtfl w16du wp14">
   <w:body>
     <w:p>
       <w:pPr>
@@ -22,23 +22,7 @@
           <w:b/>
           <w:bCs/>
         </w:rPr>
-        <w:t xml:space="preserve">, </w:t>
-      </w:r>
-      <w:proofErr w:type="spellStart"/>
-      <w:r>
-        <w:rPr>
-          <w:b/>
-          <w:bCs/>
-        </w:rPr>
-        <w:t>Maximilianus</w:t>
-      </w:r>
-      <w:proofErr w:type="spellEnd"/>
-      <w:r>
-        <w:rPr>
-          <w:b/>
-          <w:bCs/>
-        </w:rPr>
-        <w:t xml:space="preserve"> (</w:t>
+        <w:t>, Maximilianus (</w:t>
       </w:r>
       <w:r>
         <w:rPr>
@@ -169,112 +153,42 @@
           <w:bCs/>
           <w:lang w:val="en-US"/>
         </w:rPr>
-        <w:t xml:space="preserve">practitioner, and Anneke Anna </w:t>
-      </w:r>
-      <w:proofErr w:type="spellStart"/>
+        <w:t xml:space="preserve">practitioner, and Anneke Anna Hendrika Veldhuizen van Zanten. </w:t>
+      </w:r>
       <w:r>
         <w:rPr>
           <w:b/>
           <w:bCs/>
-          <w:lang w:val="en-US"/>
-        </w:rPr>
-        <w:t>Hendrika</w:t>
-      </w:r>
-      <w:proofErr w:type="spellEnd"/>
+        </w:rPr>
+        <w:t>On 11 July 19</w:t>
+      </w:r>
       <w:r>
         <w:rPr>
           <w:b/>
           <w:bCs/>
-          <w:lang w:val="en-US"/>
-        </w:rPr>
-        <w:t xml:space="preserve"> </w:t>
-      </w:r>
-      <w:proofErr w:type="spellStart"/>
+        </w:rPr>
+        <w:t>5</w:t>
+      </w:r>
       <w:r>
         <w:rPr>
           <w:b/>
           <w:bCs/>
-          <w:lang w:val="en-US"/>
-        </w:rPr>
-        <w:t>Veldhuizen</w:t>
-      </w:r>
-      <w:proofErr w:type="spellEnd"/>
+        </w:rPr>
+        <w:t>3 he married Maria Johanna A</w:t>
+      </w:r>
       <w:r>
         <w:rPr>
           <w:b/>
           <w:bCs/>
-          <w:lang w:val="en-US"/>
-        </w:rPr>
-        <w:t xml:space="preserve"> van </w:t>
-      </w:r>
-      <w:proofErr w:type="spellStart"/>
+        </w:rPr>
+        <w:t>r</w:t>
+      </w:r>
       <w:r>
         <w:rPr>
           <w:b/>
           <w:bCs/>
-          <w:lang w:val="en-US"/>
-        </w:rPr>
-        <w:t>Zanten</w:t>
-      </w:r>
-      <w:proofErr w:type="spellEnd"/>
-      <w:r>
-        <w:rPr>
-          <w:b/>
-          <w:bCs/>
-          <w:lang w:val="en-US"/>
-        </w:rPr>
-        <w:t xml:space="preserve">. </w:t>
-      </w:r>
-      <w:r>
-        <w:rPr>
-          <w:b/>
-          <w:bCs/>
-        </w:rPr>
-        <w:t>On 11 July 19</w:t>
-      </w:r>
-      <w:r>
-        <w:rPr>
-          <w:b/>
-          <w:bCs/>
-        </w:rPr>
-        <w:t>5</w:t>
-      </w:r>
-      <w:r>
-        <w:rPr>
-          <w:b/>
-          <w:bCs/>
-        </w:rPr>
-        <w:t xml:space="preserve">3 he married Maria Johanna </w:t>
-      </w:r>
-      <w:proofErr w:type="spellStart"/>
-      <w:r>
-        <w:rPr>
-          <w:b/>
-          <w:bCs/>
-        </w:rPr>
-        <w:t>A</w:t>
-      </w:r>
-      <w:r>
-        <w:rPr>
-          <w:b/>
-          <w:bCs/>
-        </w:rPr>
-        <w:t>r</w:t>
-      </w:r>
-      <w:r>
-        <w:rPr>
-          <w:b/>
-          <w:bCs/>
-        </w:rPr>
-        <w:t>itia</w:t>
-      </w:r>
-      <w:proofErr w:type="spellEnd"/>
-      <w:r>
-        <w:rPr>
-          <w:b/>
-          <w:bCs/>
-        </w:rPr>
-        <w:t xml:space="preserve"> de Kanter, with whom he had four daughters and one son. Th</w:t>
+        </w:rPr>
+        <w:t>itia de Kanter, with whom he had four daughters and one son. Th</w:t>
       </w:r>
       <w:r>
         <w:rPr>
@@ -301,23 +215,14 @@
         <w:jc w:val="both"/>
       </w:pPr>
       <w:r>
-        <w:fldChar w:fldCharType="begin"/>
-      </w:r>
-      <w:r>
-        <w:instrText xml:space="preserve"> INCLUDEPICTURE "/Users/bobreinalda/Library/Group Containers/UBF8T346G9.ms/WebArchiveCopyPasteTempFiles/com.microsoft.Word/104259.jpg?1517406099" \* MERGEFORMATINET </w:instrText>
-      </w:r>
-      <w:r>
-        <w:fldChar w:fldCharType="separate"/>
-      </w:r>
-      <w:r>
         <w:rPr>
           <w:noProof/>
         </w:rPr>
         <w:drawing>
-          <wp:inline distT="0" distB="0" distL="0" distR="0" wp14:anchorId="5A1D7A75" wp14:editId="37EFCF2B">
-            <wp:extent cx="1816100" cy="2095500"/>
-            <wp:effectExtent l="0" t="0" r="0" b="0"/>
-            <wp:docPr id="2" name="Afbeelding 2" descr="Afbeelding met Menselijk gezicht, person, kleding, persoon&#10;&#10;Automatisch gegenereerde beschrijving"/>
+          <wp:inline distT="0" distB="0" distL="0" distR="0" wp14:anchorId="46C848E9" wp14:editId="61E3EC53">
+            <wp:extent cx="1621892" cy="2412564"/>
+            <wp:effectExtent l="0" t="0" r="3810" b="635"/>
+            <wp:docPr id="1833023648" name="Afbeelding 1"/>
             <wp:cNvGraphicFramePr>
               <a:graphicFrameLocks xmlns:a="http://schemas.openxmlformats.org/drawingml/2006/main" noChangeAspect="1"/>
             </wp:cNvGraphicFramePr>
@@ -325,12 +230,10 @@
               <a:graphicData uri="http://schemas.openxmlformats.org/drawingml/2006/picture">
                 <pic:pic xmlns:pic="http://schemas.openxmlformats.org/drawingml/2006/picture">
                   <pic:nvPicPr>
-                    <pic:cNvPr id="2" name="Afbeelding 2" descr="Afbeelding met Menselijk gezicht, person, kleding, persoon&#10;&#10;Automatisch gegenereerde beschrijving"/>
-                    <pic:cNvPicPr>
-                      <a:picLocks noChangeAspect="1" noChangeArrowheads="1"/>
-                    </pic:cNvPicPr>
+                    <pic:cNvPr id="1833023648" name="Afbeelding 1833023648"/>
+                    <pic:cNvPicPr/>
                   </pic:nvPicPr>
-                  <pic:blipFill rotWithShape="1">
+                  <pic:blipFill>
                     <a:blip r:embed="rId7">
                       <a:extLst>
                         <a:ext uri="{28A0092B-C50C-407E-A947-70E740481C1C}">
@@ -338,26 +241,18 @@
                         </a:ext>
                       </a:extLst>
                     </a:blip>
-                    <a:srcRect l="47210" t="22794" r="21244" b="28676"/>
-                    <a:stretch/>
+                    <a:stretch>
+                      <a:fillRect/>
+                    </a:stretch>
                   </pic:blipFill>
-                  <pic:spPr bwMode="auto">
+                  <pic:spPr>
                     <a:xfrm>
                       <a:off x="0" y="0"/>
-                      <a:ext cx="1816100" cy="2095500"/>
+                      <a:ext cx="1648314" cy="2451866"/>
                     </a:xfrm>
                     <a:prstGeom prst="rect">
                       <a:avLst/>
                     </a:prstGeom>
-                    <a:noFill/>
-                    <a:ln>
-                      <a:noFill/>
-                    </a:ln>
-                    <a:extLst>
-                      <a:ext uri="{53640926-AAD7-44D8-BBD7-CCE9431645EC}">
-                        <a14:shadowObscured xmlns:a14="http://schemas.microsoft.com/office/drawing/2010/main"/>
-                      </a:ext>
-                    </a:extLst>
                   </pic:spPr>
                 </pic:pic>
               </a:graphicData>
@@ -365,9 +260,6 @@
           </wp:inline>
         </w:drawing>
       </w:r>
-      <w:r>
-        <w:fldChar w:fldCharType="end"/>
-      </w:r>
     </w:p>
     <w:p>
       <w:pPr>
@@ -376,15 +268,12 @@
       <w:r>
         <w:t xml:space="preserve">Source: </w:t>
       </w:r>
-      <w:hyperlink r:id="rId8" w:history="1">
-        <w:r>
-          <w:rPr>
-            <w:rStyle w:val="Hyperlink"/>
-            <w:u w:val="none"/>
-          </w:rPr>
-          <w:t>www.osce.org/hcnm/104260</w:t>
-        </w:r>
-      </w:hyperlink>
+      <w:r>
+        <w:rPr>
+          <w:rFonts w:cs="Times New Roman"/>
+        </w:rPr>
+        <w:t>Van der Stoel, 3 November 1983, Wikimedia Commons, photographer Frank Hall</w:t>
+      </w:r>
     </w:p>
     <w:p>
       <w:pPr>
@@ -712,15 +601,7 @@
       </w:r>
       <w:proofErr w:type="spellEnd"/>
       <w:r>
-        <w:t xml:space="preserve"> </w:t>
-      </w:r>
-      <w:proofErr w:type="spellStart"/>
-      <w:r>
-        <w:t>Mansholt</w:t>
-      </w:r>
-      <w:proofErr w:type="spellEnd"/>
-      <w:r>
-        <w:t xml:space="preserve"> at the European Commission</w:t>
+        <w:t xml:space="preserve"> Mansholt at the European Commission</w:t>
       </w:r>
       <w:r>
         <w:t xml:space="preserve"> in 1958</w:t>
@@ -843,7 +724,11 @@
         <w:t xml:space="preserve">at home </w:t>
       </w:r>
       <w:r>
-        <w:t xml:space="preserve">defended the proposal to have the military headquarters of American troops of the North Atlantic Treaty Organization (NATO) </w:t>
+        <w:t xml:space="preserve">defended </w:t>
+      </w:r>
+      <w:r>
+        <w:lastRenderedPageBreak/>
+        <w:t xml:space="preserve">the proposal to have the military headquarters of American troops of the North Atlantic Treaty Organization (NATO) </w:t>
       </w:r>
       <w:r>
         <w:t xml:space="preserve">located </w:t>
@@ -858,11 +743,7 @@
         <w:t>he Netherlands</w:t>
       </w:r>
       <w:r>
-        <w:t xml:space="preserve">. His cooperation with Foreign Minister </w:t>
-      </w:r>
-      <w:r>
-        <w:lastRenderedPageBreak/>
-        <w:t>Joseph Luns was good, although they differed in opinion on decolonization and development aid</w:t>
+        <w:t>. His cooperation with Foreign Minister Joseph Luns was good, although they differed in opinion on decolonization and development aid</w:t>
       </w:r>
       <w:r>
         <w:t>. I</w:t>
@@ -1321,13 +1202,8 @@
         <w:t>leaning</w:t>
       </w:r>
       <w:r>
-        <w:t xml:space="preserve"> government led by Joop den </w:t>
-      </w:r>
-      <w:proofErr w:type="spellStart"/>
-      <w:r>
-        <w:t>Uyl</w:t>
-      </w:r>
-      <w:proofErr w:type="spellEnd"/>
+        <w:t xml:space="preserve"> government led by Joop den Uyl</w:t>
+      </w:r>
       <w:r>
         <w:t xml:space="preserve"> in May 1973</w:t>
       </w:r>
@@ -1757,29 +1633,7 @@
           <w:szCs w:val="24"/>
           <w:lang w:val="en-GB"/>
         </w:rPr>
-        <w:t xml:space="preserve"> the Soviet Union and China and, in 1975, published, together with State Secretary for Foreign Affairs Peter </w:t>
-      </w:r>
-      <w:proofErr w:type="spellStart"/>
-      <w:r>
-        <w:rPr>
-          <w:b w:val="0"/>
-          <w:bCs w:val="0"/>
-          <w:sz w:val="24"/>
-          <w:szCs w:val="24"/>
-          <w:lang w:val="en-GB"/>
-        </w:rPr>
-        <w:t>Kooijmans</w:t>
-      </w:r>
-      <w:proofErr w:type="spellEnd"/>
-      <w:r>
-        <w:rPr>
-          <w:b w:val="0"/>
-          <w:bCs w:val="0"/>
-          <w:sz w:val="24"/>
-          <w:szCs w:val="24"/>
-          <w:lang w:val="en-GB"/>
-        </w:rPr>
-        <w:t xml:space="preserve">, a </w:t>
+        <w:t xml:space="preserve"> the Soviet Union and China and, in 1975, published, together with State Secretary for Foreign Affairs Peter Kooijmans, a </w:t>
       </w:r>
       <w:r>
         <w:rPr>
@@ -1989,7 +1843,18 @@
           <w:szCs w:val="24"/>
           <w:lang w:val="en-GB"/>
         </w:rPr>
-        <w:t xml:space="preserve"> making human rights one of the purposes of Dutch foreign policy,</w:t>
+        <w:t xml:space="preserve"> making human </w:t>
+      </w:r>
+      <w:r>
+        <w:rPr>
+          <w:b w:val="0"/>
+          <w:bCs w:val="0"/>
+          <w:sz w:val="24"/>
+          <w:szCs w:val="24"/>
+          <w:lang w:val="en-GB"/>
+        </w:rPr>
+        <w:lastRenderedPageBreak/>
+        <w:t>rights one of the purposes of Dutch foreign policy,</w:t>
       </w:r>
       <w:r>
         <w:rPr>
@@ -2039,18 +1904,7 @@
           <w:szCs w:val="24"/>
           <w:lang w:val="en-GB"/>
         </w:rPr>
-        <w:t xml:space="preserve"> and economic cooperation </w:t>
-      </w:r>
-      <w:r>
-        <w:rPr>
-          <w:b w:val="0"/>
-          <w:bCs w:val="0"/>
-          <w:sz w:val="24"/>
-          <w:szCs w:val="24"/>
-          <w:lang w:val="en-GB"/>
-        </w:rPr>
-        <w:lastRenderedPageBreak/>
-        <w:t xml:space="preserve">the Final Act agreed </w:t>
+        <w:t xml:space="preserve"> and economic cooperation the Final Act agreed </w:t>
       </w:r>
       <w:r>
         <w:rPr>
@@ -2300,18 +2154,7 @@
           <w:szCs w:val="24"/>
           <w:lang w:val="en-GB"/>
         </w:rPr>
-        <w:t xml:space="preserve">) and could discuss any topic. When Jan </w:t>
-      </w:r>
-      <w:proofErr w:type="spellStart"/>
-      <w:r>
-        <w:rPr>
-          <w:b w:val="0"/>
-          <w:bCs w:val="0"/>
-          <w:sz w:val="24"/>
-          <w:szCs w:val="24"/>
-          <w:lang w:val="en-GB"/>
-        </w:rPr>
-        <w:t>Pato</w:t>
+        <w:t>) and could discuss any topic. When Jan Pato</w:t>
       </w:r>
       <w:r>
         <w:rPr>
@@ -2333,18 +2176,7 @@
           <w:szCs w:val="24"/>
           <w:lang w:val="en-GB"/>
         </w:rPr>
-        <w:t>ka</w:t>
-      </w:r>
-      <w:proofErr w:type="spellEnd"/>
-      <w:r>
-        <w:rPr>
-          <w:b w:val="0"/>
-          <w:bCs w:val="0"/>
-          <w:sz w:val="24"/>
-          <w:szCs w:val="24"/>
-          <w:lang w:val="en-GB"/>
-        </w:rPr>
-        <w:t xml:space="preserve">, </w:t>
+        <w:t xml:space="preserve">ka, </w:t>
       </w:r>
       <w:r>
         <w:rPr>
@@ -2439,20 +2271,8 @@
           <w:szCs w:val="24"/>
           <w:lang w:val="en-GB"/>
         </w:rPr>
-        <w:t xml:space="preserve"> </w:t>
-      </w:r>
-      <w:proofErr w:type="spellStart"/>
-      <w:r>
-        <w:rPr>
-          <w:b w:val="0"/>
-          <w:bCs w:val="0"/>
-          <w:sz w:val="24"/>
-          <w:szCs w:val="24"/>
-          <w:lang w:val="en-GB"/>
-        </w:rPr>
-        <w:t>Hájek</w:t>
-      </w:r>
-      <w:proofErr w:type="spellEnd"/>
+        <w:t xml:space="preserve"> Hájek</w:t>
+      </w:r>
       <w:r>
         <w:rPr>
           <w:b w:val="0"/>
@@ -2741,18 +2561,7 @@
           <w:szCs w:val="24"/>
           <w:lang w:val="en-GB"/>
         </w:rPr>
-        <w:t>(</w:t>
-      </w:r>
-      <w:proofErr w:type="spellStart"/>
-      <w:r>
-        <w:rPr>
-          <w:b w:val="0"/>
-          <w:bCs w:val="0"/>
-          <w:sz w:val="24"/>
-          <w:szCs w:val="24"/>
-          <w:lang w:val="en-GB"/>
-        </w:rPr>
-        <w:t>Pato</w:t>
+        <w:t>(Pato</w:t>
       </w:r>
       <w:r>
         <w:rPr>
@@ -2774,18 +2583,7 @@
           <w:szCs w:val="24"/>
           <w:lang w:val="en-GB"/>
         </w:rPr>
-        <w:t>ka</w:t>
-      </w:r>
-      <w:proofErr w:type="spellEnd"/>
-      <w:r>
-        <w:rPr>
-          <w:b w:val="0"/>
-          <w:bCs w:val="0"/>
-          <w:sz w:val="24"/>
-          <w:szCs w:val="24"/>
-          <w:lang w:val="en-GB"/>
-        </w:rPr>
-        <w:t xml:space="preserve"> was arrested</w:t>
+        <w:t>ka was arrested</w:t>
       </w:r>
       <w:r>
         <w:rPr>
@@ -3698,16 +3496,11 @@
         <w:t xml:space="preserve"> and </w:t>
       </w:r>
       <w:r>
-        <w:t xml:space="preserve">UN Secretary-General Javier Pérez de </w:t>
-      </w:r>
-      <w:proofErr w:type="spellStart"/>
-      <w:r>
-        <w:t>Cuéllar</w:t>
+        <w:t>UN Secretary-General Javier Pérez de Cuéllar</w:t>
       </w:r>
       <w:r>
         <w:t>’s</w:t>
       </w:r>
-      <w:proofErr w:type="spellEnd"/>
       <w:r>
         <w:t xml:space="preserve"> exten</w:t>
       </w:r>
@@ -4016,7 +3809,11 @@
         <w:t>hanks to his good relations with US Deputy Secretary of State Lawrence Eagleburger</w:t>
       </w:r>
       <w:r>
-        <w:t xml:space="preserve"> and a novel Council procedure</w:t>
+        <w:t xml:space="preserve"> and a </w:t>
+      </w:r>
+      <w:r>
+        <w:lastRenderedPageBreak/>
+        <w:t>novel Council procedure</w:t>
       </w:r>
       <w:r>
         <w:t xml:space="preserve">. Iraq no longer allowed him into the </w:t>
@@ -4025,11 +3822,7 @@
         <w:t>country,</w:t>
       </w:r>
       <w:r>
-        <w:t xml:space="preserve"> but Van der Stoel </w:t>
-      </w:r>
-      <w:r>
-        <w:lastRenderedPageBreak/>
-        <w:t xml:space="preserve">reported </w:t>
+        <w:t xml:space="preserve"> but Van der Stoel reported </w:t>
       </w:r>
       <w:r>
         <w:t xml:space="preserve">in detail </w:t>
@@ -4761,7 +4554,11 @@
         <w:t xml:space="preserve"> </w:t>
       </w:r>
       <w:r>
-        <w:t>(he created trust among his interlocutors by not talking about sensitive issues in pub</w:t>
+        <w:t xml:space="preserve">(he created trust among his interlocutors by not talking about </w:t>
+      </w:r>
+      <w:r>
+        <w:lastRenderedPageBreak/>
+        <w:t>sensitive issues in pub</w:t>
       </w:r>
       <w:r>
         <w:t>l</w:t>
@@ -4776,11 +4573,7 @@
         <w:t>ed</w:t>
       </w:r>
       <w:r>
-        <w:t xml:space="preserve"> follow-up meetings and incrementalism. He tried to </w:t>
-      </w:r>
-      <w:r>
-        <w:lastRenderedPageBreak/>
-        <w:t xml:space="preserve">work with the states he visited, rather than against them, aware that political solutions require compromise, for him a matter of pragmatism based on principles. </w:t>
+        <w:t xml:space="preserve"> follow-up meetings and incrementalism. He tried to work with the states he visited, rather than against them, aware that political solutions require compromise, for him a matter of pragmatism based on principles. </w:t>
       </w:r>
       <w:r>
         <w:t>Believing that</w:t>
@@ -4981,11 +4774,7 @@
         <w:t xml:space="preserve"> </w:t>
       </w:r>
       <w:r>
-        <w:t xml:space="preserve">Rolf </w:t>
-      </w:r>
-      <w:proofErr w:type="spellStart"/>
-      <w:r>
-        <w:t>Ek</w:t>
+        <w:t>Rolf Ek</w:t>
       </w:r>
       <w:r>
         <w:t>é</w:t>
@@ -4993,7 +4782,6 @@
       <w:r>
         <w:t>us</w:t>
       </w:r>
-      <w:proofErr w:type="spellEnd"/>
       <w:r>
         <w:t>.</w:t>
       </w:r>
@@ -5055,15 +4843,7 @@
         <w:t>convinced</w:t>
       </w:r>
       <w:r>
-        <w:t xml:space="preserve"> Jorge </w:t>
-      </w:r>
-      <w:proofErr w:type="spellStart"/>
-      <w:r>
-        <w:t>Zorreguieta</w:t>
-      </w:r>
-      <w:proofErr w:type="spellEnd"/>
-      <w:r>
-        <w:t xml:space="preserve">, who had been a minister under </w:t>
+        <w:t xml:space="preserve"> Jorge Zorreguieta, who had been a minister under </w:t>
       </w:r>
       <w:r>
         <w:t xml:space="preserve">the </w:t>
@@ -5192,11 +4972,7 @@
         <w:t xml:space="preserve"> park </w:t>
       </w:r>
       <w:r>
-        <w:t xml:space="preserve">on Jan </w:t>
-      </w:r>
-      <w:proofErr w:type="spellStart"/>
-      <w:r>
-        <w:t>Pato</w:t>
+        <w:t>on Jan Pato</w:t>
       </w:r>
       <w:r>
         <w:rPr>
@@ -5206,11 +4982,7 @@
         <w:t>č</w:t>
       </w:r>
       <w:r>
-        <w:t>ka</w:t>
-      </w:r>
-      <w:proofErr w:type="spellEnd"/>
-      <w:r>
-        <w:t xml:space="preserve"> Street</w:t>
+        <w:t>ka Street</w:t>
       </w:r>
       <w:r>
         <w:t xml:space="preserve"> i</w:t>
@@ -5278,7 +5050,7 @@
       <w:r>
         <w:t xml:space="preserve"> </w:t>
       </w:r>
-      <w:hyperlink r:id="rId9" w:history="1">
+      <w:hyperlink r:id="rId8" w:history="1">
         <w:r>
           <w:rPr>
             <w:rStyle w:val="Hyperlink"/>
@@ -5308,49 +5080,53 @@
       <w:r>
         <w:t xml:space="preserve"> </w:t>
       </w:r>
-      <w:proofErr w:type="spellStart"/>
       <w:r>
         <w:rPr>
           <w:i/>
           <w:iCs/>
         </w:rPr>
-        <w:t>Hulp</w:t>
-      </w:r>
-      <w:proofErr w:type="spellEnd"/>
+        <w:t xml:space="preserve">Hulp </w:t>
+      </w:r>
+      <w:proofErr w:type="spellStart"/>
       <w:r>
         <w:rPr>
           <w:i/>
           <w:iCs/>
         </w:rPr>
-        <w:t xml:space="preserve"> </w:t>
-      </w:r>
-      <w:proofErr w:type="spellStart"/>
+        <w:t>aan</w:t>
+      </w:r>
+      <w:proofErr w:type="spellEnd"/>
       <w:r>
         <w:rPr>
           <w:i/>
           <w:iCs/>
         </w:rPr>
-        <w:t>aan</w:t>
-      </w:r>
-      <w:proofErr w:type="spellEnd"/>
+        <w:t xml:space="preserve"> </w:t>
+      </w:r>
+      <w:proofErr w:type="spellStart"/>
       <w:r>
         <w:rPr>
           <w:i/>
           <w:iCs/>
         </w:rPr>
-        <w:t xml:space="preserve"> </w:t>
-      </w:r>
-      <w:proofErr w:type="spellStart"/>
+        <w:t>ontwikkelingslanden</w:t>
+      </w:r>
+      <w:proofErr w:type="spellEnd"/>
+      <w:r>
+        <w:t>, Amsterdam 1963;</w:t>
+      </w:r>
+      <w:r>
+        <w:t xml:space="preserve"> </w:t>
+      </w:r>
       <w:r>
         <w:rPr>
           <w:i/>
           <w:iCs/>
         </w:rPr>
-        <w:t>ontwikkelingslanden</w:t>
-      </w:r>
-      <w:proofErr w:type="spellEnd"/>
-      <w:r>
-        <w:t>, Amsterdam 1963;</w:t>
+        <w:t>The Cohesion of the Alliance: Report on the Seminar Held in The Hague from 17-24 April 1966</w:t>
+      </w:r>
+      <w:r>
+        <w:t>, The Hague 1966;</w:t>
       </w:r>
       <w:r>
         <w:t xml:space="preserve"> </w:t>
@@ -5360,100 +5136,100 @@
           <w:i/>
           <w:iCs/>
         </w:rPr>
-        <w:t>The Cohesion of the Alliance: Report on the Seminar Held in The Hague from 17-24 April 1966</w:t>
-      </w:r>
-      <w:r>
-        <w:t>, The Hague 1966;</w:t>
-      </w:r>
-      <w:r>
-        <w:t xml:space="preserve"> </w:t>
-      </w:r>
+        <w:t xml:space="preserve">The British Application for Membership of the European Communities = La candidature </w:t>
+      </w:r>
+      <w:proofErr w:type="spellStart"/>
       <w:r>
         <w:rPr>
           <w:i/>
           <w:iCs/>
         </w:rPr>
-        <w:t xml:space="preserve">The British Application for Membership of the European Communities = La candidature </w:t>
-      </w:r>
-      <w:proofErr w:type="spellStart"/>
+        <w:t>brittanique</w:t>
+      </w:r>
+      <w:proofErr w:type="spellEnd"/>
       <w:r>
         <w:rPr>
           <w:i/>
           <w:iCs/>
         </w:rPr>
-        <w:t>brittanique</w:t>
-      </w:r>
-      <w:proofErr w:type="spellEnd"/>
+        <w:t xml:space="preserve"> aux </w:t>
+      </w:r>
+      <w:proofErr w:type="spellStart"/>
       <w:r>
         <w:rPr>
           <w:i/>
           <w:iCs/>
         </w:rPr>
-        <w:t xml:space="preserve"> aux </w:t>
-      </w:r>
-      <w:proofErr w:type="spellStart"/>
+        <w:t>Communautés</w:t>
+      </w:r>
+      <w:proofErr w:type="spellEnd"/>
       <w:r>
         <w:rPr>
           <w:i/>
           <w:iCs/>
         </w:rPr>
-        <w:t>Communautés</w:t>
-      </w:r>
-      <w:proofErr w:type="spellEnd"/>
+        <w:t xml:space="preserve"> </w:t>
+      </w:r>
+      <w:proofErr w:type="spellStart"/>
       <w:r>
         <w:rPr>
           <w:i/>
           <w:iCs/>
         </w:rPr>
-        <w:t xml:space="preserve"> </w:t>
-      </w:r>
-      <w:proofErr w:type="spellStart"/>
+        <w:t>européennes</w:t>
+      </w:r>
+      <w:proofErr w:type="spellEnd"/>
       <w:r>
         <w:rPr>
           <w:i/>
           <w:iCs/>
         </w:rPr>
-        <w:t>européennes</w:t>
-      </w:r>
-      <w:proofErr w:type="spellEnd"/>
+        <w:t>, 1963-1968</w:t>
+      </w:r>
+      <w:r>
+        <w:t xml:space="preserve">, Paris 1968; </w:t>
+      </w:r>
       <w:r>
         <w:rPr>
           <w:i/>
           <w:iCs/>
         </w:rPr>
-        <w:t>, 1963-1968</w:t>
-      </w:r>
-      <w:r>
-        <w:t xml:space="preserve">, Paris 1968; </w:t>
+        <w:t>Interim Report on the Situation of Humans Rights in Iraq, Prepared by Mr. Max van der Stoel, Special Rapporteur</w:t>
+      </w:r>
+      <w:r>
+        <w:t xml:space="preserve">, New York 1992-1999; </w:t>
+      </w:r>
+      <w:r>
+        <w:t xml:space="preserve">‘Controlling Ethnic Tensions in Europe: The Experience of the CSCE High Commissioner on National Minorities’ in </w:t>
       </w:r>
       <w:r>
         <w:rPr>
           <w:i/>
           <w:iCs/>
         </w:rPr>
-        <w:t>Interim Report on the Situation of Humans Rights in Iraq, Prepared by Mr. Max van der Stoel, Special Rapporteur</w:t>
-      </w:r>
-      <w:r>
-        <w:t xml:space="preserve">, New York 1992-1999; </w:t>
-      </w:r>
-      <w:r>
-        <w:t xml:space="preserve">‘Controlling Ethnic Tensions in Europe: The Experience of the CSCE High Commissioner on National Minorities’ in </w:t>
+        <w:t>Refugee Survey Quarterly</w:t>
+      </w:r>
+      <w:r>
+        <w:t>, 13/4, 1994, 88-96;</w:t>
+      </w:r>
+      <w:r>
+        <w:t xml:space="preserve"> </w:t>
+      </w:r>
+      <w:r>
+        <w:t xml:space="preserve">‘The Heart of the Matter’ in </w:t>
       </w:r>
       <w:r>
         <w:rPr>
           <w:i/>
           <w:iCs/>
         </w:rPr>
-        <w:t>Refugee Survey Quarterly</w:t>
-      </w:r>
-      <w:r>
-        <w:t>, 13/4, 1994, 88-96;</w:t>
-      </w:r>
-      <w:r>
-        <w:t xml:space="preserve"> </w:t>
-      </w:r>
-      <w:r>
-        <w:t xml:space="preserve">‘The Heart of the Matter’ in </w:t>
+        <w:t>Helsinki Monitor</w:t>
+      </w:r>
+      <w:r>
+        <w:t xml:space="preserve">, 6/3, 1995, 23-30; </w:t>
+      </w:r>
+      <w:r>
+        <w:t xml:space="preserve">‘Report of the OSCE High Commissioner on National Minorities OSCE: Implementation Meeting on Human Dimension Issues, Warsaw, 2-19 October 1995’ in </w:t>
       </w:r>
       <w:r>
         <w:rPr>
@@ -5463,33 +5239,28 @@
         <w:t>Helsinki Monitor</w:t>
       </w:r>
       <w:r>
-        <w:t xml:space="preserve">, 6/3, 1995, 23-30; </w:t>
-      </w:r>
-      <w:r>
-        <w:t xml:space="preserve">‘Report of the OSCE High Commissioner on National Minorities OSCE: Implementation Meeting on Human Dimension Issues, Warsaw, 2-19 October 1995’ in </w:t>
+        <w:t>, 6/4, 1995, 35-40;</w:t>
+      </w:r>
+      <w:r>
+        <w:t xml:space="preserve"> ‘</w:t>
+      </w:r>
+      <w:r>
+        <w:t xml:space="preserve">Introduction to the Seminar [on Minority and Group Rights in Vienna]’ in </w:t>
       </w:r>
       <w:r>
         <w:rPr>
           <w:i/>
           <w:iCs/>
         </w:rPr>
-        <w:t>Helsinki Monitor</w:t>
-      </w:r>
-      <w:r>
-        <w:t>, 6/4, 1995, 35-40;</w:t>
-      </w:r>
-      <w:r>
-        <w:t xml:space="preserve"> ‘</w:t>
-      </w:r>
-      <w:r>
-        <w:t xml:space="preserve">Introduction to the Seminar [on Minority and Group Rights in Vienna]’ in </w:t>
+        <w:t xml:space="preserve">International Journal on Minority and </w:t>
       </w:r>
       <w:r>
         <w:rPr>
           <w:i/>
           <w:iCs/>
         </w:rPr>
-        <w:t>International Journal on Minority and Group Rights</w:t>
+        <w:lastRenderedPageBreak/>
+        <w:t>Group Rights</w:t>
       </w:r>
       <w:r>
         <w:t>, 4/2, 1996, 153-155;</w:t>
@@ -5502,15 +5273,7 @@
           <w:i/>
           <w:iCs/>
         </w:rPr>
-        <w:t xml:space="preserve">Situation of Human Rights in Iraq: Report, submitted by the </w:t>
-      </w:r>
-      <w:r>
-        <w:rPr>
-          <w:i/>
-          <w:iCs/>
-        </w:rPr>
-        <w:lastRenderedPageBreak/>
-        <w:t>Special Rapporteur, Max van der Stoel, in accordance with Commission Resolution 1998/65</w:t>
+        <w:t>Situation of Human Rights in Iraq: Report, submitted by the Special Rapporteur, Max van der Stoel, in accordance with Commission Resolution 1998/65</w:t>
       </w:r>
       <w:r>
         <w:t xml:space="preserve">, New York 1999; </w:t>
@@ -5630,15 +5393,7 @@
       </w:r>
       <w:proofErr w:type="spellEnd"/>
       <w:r>
-        <w:t>, ‘</w:t>
-      </w:r>
-      <w:proofErr w:type="spellStart"/>
-      <w:r>
-        <w:t>Een</w:t>
-      </w:r>
-      <w:proofErr w:type="spellEnd"/>
-      <w:r>
-        <w:t xml:space="preserve"> </w:t>
+        <w:t xml:space="preserve">, ‘Een </w:t>
       </w:r>
       <w:proofErr w:type="spellStart"/>
       <w:r>
@@ -5675,7 +5430,7 @@
           <w:i/>
           <w:iCs/>
         </w:rPr>
-        <w:t xml:space="preserve">De </w:t>
+        <w:t xml:space="preserve">De Nederlandse ministers van </w:t>
       </w:r>
       <w:proofErr w:type="spellStart"/>
       <w:r>
@@ -5683,7 +5438,7 @@
           <w:i/>
           <w:iCs/>
         </w:rPr>
-        <w:t>Nederlandse</w:t>
+        <w:t>Buitenlandse</w:t>
       </w:r>
       <w:proofErr w:type="spellEnd"/>
       <w:r>
@@ -5691,7 +5446,7 @@
           <w:i/>
           <w:iCs/>
         </w:rPr>
-        <w:t xml:space="preserve"> ministers van </w:t>
+        <w:t xml:space="preserve"> Zaken in de </w:t>
       </w:r>
       <w:proofErr w:type="spellStart"/>
       <w:r>
@@ -5699,7 +5454,7 @@
           <w:i/>
           <w:iCs/>
         </w:rPr>
-        <w:t>Buitenlandse</w:t>
+        <w:t>twintigste</w:t>
       </w:r>
       <w:proofErr w:type="spellEnd"/>
       <w:r>
@@ -5715,233 +5470,193 @@
           <w:i/>
           <w:iCs/>
         </w:rPr>
-        <w:t>Zaken</w:t>
+        <w:t>eeuw</w:t>
       </w:r>
       <w:proofErr w:type="spellEnd"/>
+      <w:r>
+        <w:t>, The Hague 1999, 242-255</w:t>
+      </w:r>
+      <w:r>
+        <w:t>, 330-332</w:t>
+      </w:r>
+      <w:r>
+        <w:t xml:space="preserve">; </w:t>
+      </w:r>
+      <w:r>
+        <w:t xml:space="preserve">W.A. Kemp, </w:t>
+      </w:r>
       <w:r>
         <w:rPr>
           <w:i/>
           <w:iCs/>
         </w:rPr>
-        <w:t xml:space="preserve"> in de </w:t>
-      </w:r>
-      <w:proofErr w:type="spellStart"/>
+        <w:t xml:space="preserve">Quiet Diplomacy in Action: The OSCE High Commissioner </w:t>
+      </w:r>
       <w:r>
         <w:rPr>
           <w:i/>
           <w:iCs/>
         </w:rPr>
-        <w:t>twintigste</w:t>
-      </w:r>
-      <w:proofErr w:type="spellEnd"/>
+        <w:t>on National Minorities</w:t>
+      </w:r>
+      <w:r>
+        <w:t xml:space="preserve">, The Hague 2001; </w:t>
+      </w:r>
+      <w:r>
+        <w:t xml:space="preserve">C. Homan, ‘Interview with Max van der Stoel, </w:t>
+      </w:r>
+      <w:r>
+        <w:t>F</w:t>
+      </w:r>
+      <w:r>
+        <w:t xml:space="preserve">ormer High Commissioner on National Minorities’ in </w:t>
+      </w:r>
       <w:r>
         <w:rPr>
           <w:i/>
           <w:iCs/>
         </w:rPr>
-        <w:t xml:space="preserve"> </w:t>
-      </w:r>
-      <w:proofErr w:type="spellStart"/>
+        <w:t>Helsinki Monitor</w:t>
+      </w:r>
+      <w:r>
+        <w:t>, 13/1, January 2002, 3-10;</w:t>
+      </w:r>
+      <w:r>
+        <w:t xml:space="preserve"> </w:t>
+      </w:r>
+      <w:r>
+        <w:t xml:space="preserve">J. Dorodnova, </w:t>
+      </w:r>
       <w:r>
         <w:rPr>
           <w:i/>
           <w:iCs/>
         </w:rPr>
-        <w:t>eeuw</w:t>
-      </w:r>
-      <w:proofErr w:type="spellEnd"/>
-      <w:r>
-        <w:t>, The Hague 1999, 242-255</w:t>
-      </w:r>
-      <w:r>
-        <w:t>, 330-332</w:t>
-      </w:r>
-      <w:r>
-        <w:t xml:space="preserve">; </w:t>
-      </w:r>
-      <w:r>
-        <w:t xml:space="preserve">W.A. Kemp, </w:t>
+        <w:t>Challenging Ethnic Democracy: Implementation of the Recommendations of the OSCE High Commissioner on National Minorities to Latvia, 1993-2001</w:t>
+      </w:r>
+      <w:r>
+        <w:t xml:space="preserve">, Hamburg 2003; </w:t>
+      </w:r>
+      <w:r>
+        <w:t>D</w:t>
+      </w:r>
+      <w:r>
+        <w:t xml:space="preserve">.J. Galbraith, </w:t>
       </w:r>
       <w:r>
         <w:rPr>
           <w:i/>
           <w:iCs/>
         </w:rPr>
-        <w:t xml:space="preserve">Quiet Diplomacy in Action: The OSCE High Commissioner </w:t>
+        <w:t>The Organization for Security and Co-operation in Europe</w:t>
+      </w:r>
+      <w:r>
+        <w:t>, London 2007; W.</w:t>
+      </w:r>
+      <w:r>
+        <w:t>A.</w:t>
+      </w:r>
+      <w:r>
+        <w:t xml:space="preserve"> Kemp</w:t>
+      </w:r>
+      <w:r>
+        <w:t>,</w:t>
+      </w:r>
+      <w:r>
+        <w:t xml:space="preserve"> ‘In Memoriam Max van der Stoel 1924-2011’ in </w:t>
       </w:r>
       <w:r>
         <w:rPr>
           <w:i/>
           <w:iCs/>
         </w:rPr>
-        <w:t>on National Minorities</w:t>
-      </w:r>
-      <w:r>
-        <w:t xml:space="preserve">, The Hague 2001; </w:t>
-      </w:r>
-      <w:r>
-        <w:t xml:space="preserve">C. Homan, ‘Interview with Max van der Stoel, </w:t>
-      </w:r>
-      <w:r>
-        <w:t>F</w:t>
-      </w:r>
-      <w:r>
-        <w:t xml:space="preserve">ormer High Commissioner on National Minorities’ in </w:t>
+        <w:t>Security and Human Rights</w:t>
+      </w:r>
+      <w:r>
+        <w:t>, 2011, nr. 1, 7-8;</w:t>
+      </w:r>
+      <w:r>
+        <w:t xml:space="preserve"> </w:t>
+      </w:r>
+      <w:r>
+        <w:t xml:space="preserve">D. Martin, ‘Max van der Stoel, Diplomat Who Uncovered Hussein’s Abuses, Dies at 86’ in </w:t>
       </w:r>
       <w:r>
         <w:rPr>
           <w:i/>
           <w:iCs/>
         </w:rPr>
-        <w:t>Helsinki Monitor</w:t>
-      </w:r>
-      <w:r>
-        <w:t>, 13/1, January 2002, 3-10;</w:t>
-      </w:r>
-      <w:r>
-        <w:t xml:space="preserve"> </w:t>
-      </w:r>
-      <w:r>
-        <w:t xml:space="preserve">J. </w:t>
-      </w:r>
-      <w:proofErr w:type="spellStart"/>
-      <w:r>
-        <w:t>Dorodnova</w:t>
-      </w:r>
-      <w:proofErr w:type="spellEnd"/>
-      <w:r>
-        <w:t xml:space="preserve">, </w:t>
+        <w:t>The</w:t>
+      </w:r>
+      <w:r>
+        <w:t xml:space="preserve"> </w:t>
       </w:r>
       <w:r>
         <w:rPr>
           <w:i/>
           <w:iCs/>
         </w:rPr>
-        <w:t>Challenging Ethnic Democracy: Implementation of the Recommendations of the OSCE High Commissioner on National Minorities to Latvia, 1993-2001</w:t>
-      </w:r>
-      <w:r>
-        <w:t xml:space="preserve">, Hamburg 2003; </w:t>
-      </w:r>
-      <w:r>
-        <w:t>D</w:t>
-      </w:r>
-      <w:r>
-        <w:t xml:space="preserve">.J. Galbraith, </w:t>
+        <w:t>New York Times</w:t>
+      </w:r>
+      <w:r>
+        <w:t xml:space="preserve">, 27 April 2011; </w:t>
+      </w:r>
+      <w:r>
+        <w:t xml:space="preserve">E. Mortimer, ‘The Legacy of Max van der Stoel’ in </w:t>
       </w:r>
       <w:r>
         <w:rPr>
           <w:i/>
           <w:iCs/>
         </w:rPr>
-        <w:t>The Organization for Security and Co-operation in Europe</w:t>
-      </w:r>
-      <w:r>
-        <w:t>, London 2007; W.</w:t>
-      </w:r>
-      <w:r>
-        <w:t>A.</w:t>
-      </w:r>
-      <w:r>
-        <w:t xml:space="preserve"> Kemp</w:t>
-      </w:r>
-      <w:r>
-        <w:t>,</w:t>
-      </w:r>
-      <w:r>
-        <w:t xml:space="preserve"> ‘In Memoriam Max van der Stoel 1924-2011’ in </w:t>
+        <w:t>Security and Human Rights</w:t>
+      </w:r>
+      <w:r>
+        <w:t>, 22/3, 2011, 187-190;</w:t>
+      </w:r>
+      <w:r>
+        <w:t xml:space="preserve"> </w:t>
       </w:r>
       <w:r>
         <w:rPr>
           <w:i/>
           <w:iCs/>
         </w:rPr>
-        <w:t>Security and Human Rights</w:t>
-      </w:r>
-      <w:r>
-        <w:t>, 2011, nr. 1, 7-8;</w:t>
-      </w:r>
-      <w:r>
-        <w:t xml:space="preserve"> </w:t>
-      </w:r>
-      <w:r>
-        <w:t xml:space="preserve">D. Martin, ‘Max van der Stoel, Diplomat Who Uncovered Hussein’s Abuses, Dies at 86’ in </w:t>
+        <w:t>A Tribute to Max van der Stoel</w:t>
+      </w:r>
+      <w:r>
+        <w:t xml:space="preserve">. Special Issue, </w:t>
       </w:r>
       <w:r>
         <w:rPr>
           <w:i/>
           <w:iCs/>
         </w:rPr>
-        <w:t>The</w:t>
-      </w:r>
-      <w:r>
-        <w:t xml:space="preserve"> </w:t>
+        <w:t>Security and Human Rights</w:t>
+      </w:r>
+      <w:r>
+        <w:t>, 22/3, 2011;</w:t>
+      </w:r>
+      <w:r>
+        <w:t xml:space="preserve"> </w:t>
+      </w:r>
+      <w:r>
+        <w:t>W.</w:t>
+      </w:r>
+      <w:r>
+        <w:t>A.</w:t>
+      </w:r>
+      <w:r>
+        <w:t xml:space="preserve"> Kemp, ‘Max van der Stoel: 1924-2011’ </w:t>
+      </w:r>
+      <w:r>
+        <w:t xml:space="preserve">in </w:t>
       </w:r>
       <w:r>
         <w:rPr>
           <w:i/>
           <w:iCs/>
         </w:rPr>
-        <w:t>New York Times</w:t>
-      </w:r>
-      <w:r>
-        <w:t xml:space="preserve">, 27 April 2011; </w:t>
-      </w:r>
-      <w:r>
-        <w:t xml:space="preserve">E. Mortimer, ‘The Legacy of Max van der Stoel’ in </w:t>
-      </w:r>
-      <w:r>
-        <w:rPr>
-          <w:i/>
-          <w:iCs/>
-        </w:rPr>
-        <w:t>Security and Human Rights</w:t>
-      </w:r>
-      <w:r>
-        <w:t>, 22/3, 2011, 187-190;</w:t>
-      </w:r>
-      <w:r>
-        <w:t xml:space="preserve"> </w:t>
-      </w:r>
-      <w:r>
-        <w:rPr>
-          <w:i/>
-          <w:iCs/>
-        </w:rPr>
-        <w:t>A Tribute to Max van der Stoel</w:t>
-      </w:r>
-      <w:r>
-        <w:t xml:space="preserve">. Special Issue, </w:t>
-      </w:r>
-      <w:r>
-        <w:rPr>
-          <w:i/>
-          <w:iCs/>
-        </w:rPr>
-        <w:t>Security and Human Rights</w:t>
-      </w:r>
-      <w:r>
-        <w:t>, 22/3, 2011;</w:t>
-      </w:r>
-      <w:r>
-        <w:t xml:space="preserve"> </w:t>
-      </w:r>
-      <w:r>
-        <w:t>W.</w:t>
-      </w:r>
-      <w:r>
-        <w:t>A.</w:t>
-      </w:r>
-      <w:r>
-        <w:t xml:space="preserve"> Kemp, ‘Max van der Stoel: 1924-2011’ </w:t>
-      </w:r>
-      <w:r>
-        <w:t xml:space="preserve">in </w:t>
-      </w:r>
-      <w:r>
-        <w:rPr>
-          <w:i/>
-          <w:iCs/>
-        </w:rPr>
         <w:t>OSCE Magazine</w:t>
       </w:r>
       <w:r>
@@ -5953,7 +5668,7 @@
       <w:r>
         <w:t xml:space="preserve">see </w:t>
       </w:r>
-      <w:hyperlink r:id="rId10" w:history="1">
+      <w:hyperlink r:id="rId9" w:history="1">
         <w:r>
           <w:rPr>
             <w:rStyle w:val="Hyperlink"/>
@@ -6141,15 +5856,7 @@
         <w:jc w:val="both"/>
       </w:pPr>
       <w:r>
-        <w:t xml:space="preserve">Bob Reinalda, ‘Van der Stoel, </w:t>
-      </w:r>
-      <w:proofErr w:type="spellStart"/>
-      <w:r>
-        <w:t>Maximilianus</w:t>
-      </w:r>
-      <w:proofErr w:type="spellEnd"/>
-      <w:r>
-        <w:t xml:space="preserve">’ in </w:t>
+        <w:t xml:space="preserve">Bob Reinalda, ‘Van der Stoel, Maximilianus’ in </w:t>
       </w:r>
       <w:r>
         <w:rPr>
@@ -6166,7 +5873,7 @@
       <w:r>
         <w:t xml:space="preserve">Eisenberg, </w:t>
       </w:r>
-      <w:hyperlink r:id="rId11" w:history="1">
+      <w:hyperlink r:id="rId10" w:history="1">
         <w:r>
           <w:rPr>
             <w:rStyle w:val="Hyperlink"/>
@@ -6185,9 +5892,9 @@
       </w:pPr>
     </w:p>
     <w:sectPr>
-      <w:headerReference w:type="even" r:id="rId12"/>
-      <w:headerReference w:type="default" r:id="rId13"/>
-      <w:footerReference w:type="default" r:id="rId14"/>
+      <w:headerReference w:type="even" r:id="rId11"/>
+      <w:headerReference w:type="default" r:id="rId12"/>
+      <w:footerReference w:type="default" r:id="rId13"/>
       <w:pgSz w:w="11900" w:h="16840"/>
       <w:pgMar w:top="1418" w:right="1418" w:bottom="1418" w:left="1418" w:header="709" w:footer="709" w:gutter="0"/>
       <w:cols w:space="708"/>
@@ -6198,7 +5905,7 @@
 </file>
 
 <file path=word/endnotes.xml><?xml version="1.0" encoding="utf-8"?>
-<w:endnotes xmlns:wpc="http://schemas.microsoft.com/office/word/2010/wordprocessingCanvas" xmlns:cx="http://schemas.microsoft.com/office/drawing/2014/chartex" xmlns:cx1="http://schemas.microsoft.com/office/drawing/2015/9/8/chartex" xmlns:cx2="http://schemas.microsoft.com/office/drawing/2015/10/21/chartex" xmlns:cx3="http://schemas.microsoft.com/office/drawing/2016/5/9/chartex" xmlns:cx4="http://schemas.microsoft.com/office/drawing/2016/5/10/chartex" xmlns:cx5="http://schemas.microsoft.com/office/drawing/2016/5/11/chartex" xmlns:cx6="http://schemas.microsoft.com/office/drawing/2016/5/12/chartex" xmlns:cx7="http://schemas.microsoft.com/office/drawing/2016/5/13/chartex" xmlns:cx8="http://schemas.microsoft.com/office/drawing/2016/5/14/chartex" xmlns:mc="http://schemas.openxmlformats.org/markup-compatibility/2006" xmlns:aink="http://schemas.microsoft.com/office/drawing/2016/ink" xmlns:am3d="http://schemas.microsoft.com/office/drawing/2017/model3d" xmlns:o="urn:schemas-microsoft-com:office:office" xmlns:oel="http://schemas.microsoft.com/office/2019/extlst" xmlns:r="http://schemas.openxmlformats.org/officeDocument/2006/relationships" xmlns:m="http://schemas.openxmlformats.org/officeDocument/2006/math" xmlns:v="urn:schemas-microsoft-com:vml" xmlns:wp14="http://schemas.microsoft.com/office/word/2010/wordprocessingDrawing" xmlns:wp="http://schemas.openxmlformats.org/drawingml/2006/wordprocessingDrawing" xmlns:w10="urn:schemas-microsoft-com:office:word" xmlns:w="http://schemas.openxmlformats.org/wordprocessingml/2006/main" xmlns:w14="http://schemas.microsoft.com/office/word/2010/wordml" xmlns:w15="http://schemas.microsoft.com/office/word/2012/wordml" xmlns:w16cex="http://schemas.microsoft.com/office/word/2018/wordml/cex" xmlns:w16cid="http://schemas.microsoft.com/office/word/2016/wordml/cid" xmlns:w16="http://schemas.microsoft.com/office/word/2018/wordml" xmlns:w16du="http://schemas.microsoft.com/office/word/2023/wordml/word16du" xmlns:w16sdtdh="http://schemas.microsoft.com/office/word/2020/wordml/sdtdatahash" xmlns:w16sdtfl="http://schemas.microsoft.com/office/word/2024/wordml/sdtformatlock" xmlns:w16se="http://schemas.microsoft.com/office/word/2015/wordml/symex" xmlns:wpg="http://schemas.microsoft.com/office/word/2010/wordprocessingGroup" xmlns:wpi="http://schemas.microsoft.com/office/word/2010/wordprocessingInk" xmlns:wne="http://schemas.microsoft.com/office/word/2006/wordml" xmlns:wps="http://schemas.microsoft.com/office/word/2010/wordprocessingShape" mc:Ignorable="w14 w15 w16se w16cid w16 w16cex w16sdtdh w16sdtfl w16du wp14">
+<w:endnotes xmlns:wpc="http://schemas.microsoft.com/office/word/2010/wordprocessingCanvas" xmlns:cx="http://schemas.microsoft.com/office/drawing/2014/chartex" xmlns:cx1="http://schemas.microsoft.com/office/drawing/2015/9/8/chartex" xmlns:cx2="http://schemas.microsoft.com/office/drawing/2015/10/21/chartex" xmlns:cx3="http://schemas.microsoft.com/office/drawing/2016/5/9/chartex" xmlns:cx4="http://schemas.microsoft.com/office/drawing/2016/5/10/chartex" xmlns:cx5="http://schemas.microsoft.com/office/drawing/2016/5/11/chartex" xmlns:cx6="http://schemas.microsoft.com/office/drawing/2016/5/12/chartex" xmlns:cx7="http://schemas.microsoft.com/office/drawing/2016/5/13/chartex" xmlns:cx8="http://schemas.microsoft.com/office/drawing/2016/5/14/chartex" xmlns:mc="http://schemas.openxmlformats.org/markup-compatibility/2006" xmlns:m="http://schemas.openxmlformats.org/officeDocument/2006/math" xmlns:aink="http://schemas.microsoft.com/office/drawing/2016/ink" xmlns:am3d="http://schemas.microsoft.com/office/drawing/2017/model3d" xmlns:oel="http://schemas.microsoft.com/office/2019/extlst" xmlns:r="http://schemas.openxmlformats.org/officeDocument/2006/relationships" xmlns:wp14="http://schemas.microsoft.com/office/word/2010/wordprocessingDrawing" xmlns:wp="http://schemas.openxmlformats.org/drawingml/2006/wordprocessingDrawing" xmlns:wpg="http://schemas.microsoft.com/office/word/2010/wordprocessingGroup" xmlns:wpi="http://schemas.microsoft.com/office/word/2010/wordprocessingInk" xmlns:wps="http://schemas.microsoft.com/office/word/2010/wordprocessingShape" xmlns:o="urn:schemas-microsoft-com:office:office" xmlns:v="urn:schemas-microsoft-com:vml" xmlns:w10="urn:schemas-microsoft-com:office:word" xmlns:w="http://schemas.openxmlformats.org/wordprocessingml/2006/main" xmlns:w14="http://schemas.microsoft.com/office/word/2010/wordml" xmlns:w15="http://schemas.microsoft.com/office/word/2012/wordml" xmlns:w16cei="http://schemas.microsoft.com/office/word/2026/wordml/cei" xmlns:w16cex="http://schemas.microsoft.com/office/word/2018/wordml/cex" xmlns:w16cid="http://schemas.microsoft.com/office/word/2016/wordml/cid" xmlns:w16="http://schemas.microsoft.com/office/word/2018/wordml" xmlns:w16sdtdh="http://schemas.microsoft.com/office/word/2020/wordml/sdtdatahash" xmlns:w16sdtfl="http://schemas.microsoft.com/office/word/2024/wordml/sdtformatlock" xmlns:w16se="http://schemas.microsoft.com/office/word/2015/wordml/symex" xmlns:w16du="http://schemas.microsoft.com/office/word/2023/wordml/word16du" xmlns:wne="http://schemas.microsoft.com/office/word/2006/wordml" mc:Ignorable="w14 w15 w16se w16cid w16 w16cex w16sdtdh w16sdtfl w16du wp14">
   <w:endnote w:type="separator" w:id="-1">
     <w:p>
       <w:r>
@@ -6217,7 +5924,7 @@
 </file>
 
 <file path=word/footer1.xml><?xml version="1.0" encoding="utf-8"?>
-<w:ftr xmlns:wpc="http://schemas.microsoft.com/office/word/2010/wordprocessingCanvas" xmlns:cx="http://schemas.microsoft.com/office/drawing/2014/chartex" xmlns:cx1="http://schemas.microsoft.com/office/drawing/2015/9/8/chartex" xmlns:cx2="http://schemas.microsoft.com/office/drawing/2015/10/21/chartex" xmlns:cx3="http://schemas.microsoft.com/office/drawing/2016/5/9/chartex" xmlns:cx4="http://schemas.microsoft.com/office/drawing/2016/5/10/chartex" xmlns:cx5="http://schemas.microsoft.com/office/drawing/2016/5/11/chartex" xmlns:cx6="http://schemas.microsoft.com/office/drawing/2016/5/12/chartex" xmlns:cx7="http://schemas.microsoft.com/office/drawing/2016/5/13/chartex" xmlns:cx8="http://schemas.microsoft.com/office/drawing/2016/5/14/chartex" xmlns:mc="http://schemas.openxmlformats.org/markup-compatibility/2006" xmlns:aink="http://schemas.microsoft.com/office/drawing/2016/ink" xmlns:am3d="http://schemas.microsoft.com/office/drawing/2017/model3d" xmlns:o="urn:schemas-microsoft-com:office:office" xmlns:oel="http://schemas.microsoft.com/office/2019/extlst" xmlns:r="http://schemas.openxmlformats.org/officeDocument/2006/relationships" xmlns:m="http://schemas.openxmlformats.org/officeDocument/2006/math" xmlns:v="urn:schemas-microsoft-com:vml" xmlns:wp14="http://schemas.microsoft.com/office/word/2010/wordprocessingDrawing" xmlns:wp="http://schemas.openxmlformats.org/drawingml/2006/wordprocessingDrawing" xmlns:w10="urn:schemas-microsoft-com:office:word" xmlns:w="http://schemas.openxmlformats.org/wordprocessingml/2006/main" xmlns:w14="http://schemas.microsoft.com/office/word/2010/wordml" xmlns:w15="http://schemas.microsoft.com/office/word/2012/wordml" xmlns:w16cex="http://schemas.microsoft.com/office/word/2018/wordml/cex" xmlns:w16cid="http://schemas.microsoft.com/office/word/2016/wordml/cid" xmlns:w16="http://schemas.microsoft.com/office/word/2018/wordml" xmlns:w16du="http://schemas.microsoft.com/office/word/2023/wordml/word16du" xmlns:w16sdtdh="http://schemas.microsoft.com/office/word/2020/wordml/sdtdatahash" xmlns:w16sdtfl="http://schemas.microsoft.com/office/word/2024/wordml/sdtformatlock" xmlns:w16se="http://schemas.microsoft.com/office/word/2015/wordml/symex" xmlns:wpg="http://schemas.microsoft.com/office/word/2010/wordprocessingGroup" xmlns:wpi="http://schemas.microsoft.com/office/word/2010/wordprocessingInk" xmlns:wne="http://schemas.microsoft.com/office/word/2006/wordml" xmlns:wps="http://schemas.microsoft.com/office/word/2010/wordprocessingShape" mc:Ignorable="w14 w15 w16se w16cid w16 w16cex w16sdtdh w16sdtfl w16du wp14">
+<w:ftr xmlns:wpc="http://schemas.microsoft.com/office/word/2010/wordprocessingCanvas" xmlns:cx="http://schemas.microsoft.com/office/drawing/2014/chartex" xmlns:cx1="http://schemas.microsoft.com/office/drawing/2015/9/8/chartex" xmlns:cx2="http://schemas.microsoft.com/office/drawing/2015/10/21/chartex" xmlns:cx3="http://schemas.microsoft.com/office/drawing/2016/5/9/chartex" xmlns:cx4="http://schemas.microsoft.com/office/drawing/2016/5/10/chartex" xmlns:cx5="http://schemas.microsoft.com/office/drawing/2016/5/11/chartex" xmlns:cx6="http://schemas.microsoft.com/office/drawing/2016/5/12/chartex" xmlns:cx7="http://schemas.microsoft.com/office/drawing/2016/5/13/chartex" xmlns:cx8="http://schemas.microsoft.com/office/drawing/2016/5/14/chartex" xmlns:mc="http://schemas.openxmlformats.org/markup-compatibility/2006" xmlns:m="http://schemas.openxmlformats.org/officeDocument/2006/math" xmlns:aink="http://schemas.microsoft.com/office/drawing/2016/ink" xmlns:am3d="http://schemas.microsoft.com/office/drawing/2017/model3d" xmlns:oel="http://schemas.microsoft.com/office/2019/extlst" xmlns:r="http://schemas.openxmlformats.org/officeDocument/2006/relationships" xmlns:wp14="http://schemas.microsoft.com/office/word/2010/wordprocessingDrawing" xmlns:wp="http://schemas.openxmlformats.org/drawingml/2006/wordprocessingDrawing" xmlns:wpg="http://schemas.microsoft.com/office/word/2010/wordprocessingGroup" xmlns:wpi="http://schemas.microsoft.com/office/word/2010/wordprocessingInk" xmlns:wps="http://schemas.microsoft.com/office/word/2010/wordprocessingShape" xmlns:o="urn:schemas-microsoft-com:office:office" xmlns:v="urn:schemas-microsoft-com:vml" xmlns:w10="urn:schemas-microsoft-com:office:word" xmlns:w="http://schemas.openxmlformats.org/wordprocessingml/2006/main" xmlns:w14="http://schemas.microsoft.com/office/word/2010/wordml" xmlns:w15="http://schemas.microsoft.com/office/word/2012/wordml" xmlns:w16cei="http://schemas.microsoft.com/office/word/2026/wordml/cei" xmlns:w16cex="http://schemas.microsoft.com/office/word/2018/wordml/cex" xmlns:w16cid="http://schemas.microsoft.com/office/word/2016/wordml/cid" xmlns:w16="http://schemas.microsoft.com/office/word/2018/wordml" xmlns:w16sdtdh="http://schemas.microsoft.com/office/word/2020/wordml/sdtdatahash" xmlns:w16sdtfl="http://schemas.microsoft.com/office/word/2024/wordml/sdtformatlock" xmlns:w16se="http://schemas.microsoft.com/office/word/2015/wordml/symex" xmlns:w16du="http://schemas.microsoft.com/office/word/2023/wordml/word16du" xmlns:wne="http://schemas.microsoft.com/office/word/2006/wordml" mc:Ignorable="w14 w15 w16se w16cid w16 w16cex w16sdtdh w16sdtfl w16du wp14">
   <w:p>
     <w:pPr>
       <w:pStyle w:val="Voettekst"/>
@@ -6270,7 +5977,7 @@
 </file>
 
 <file path=word/footnotes.xml><?xml version="1.0" encoding="utf-8"?>
-<w:footnotes xmlns:wpc="http://schemas.microsoft.com/office/word/2010/wordprocessingCanvas" xmlns:cx="http://schemas.microsoft.com/office/drawing/2014/chartex" xmlns:cx1="http://schemas.microsoft.com/office/drawing/2015/9/8/chartex" xmlns:cx2="http://schemas.microsoft.com/office/drawing/2015/10/21/chartex" xmlns:cx3="http://schemas.microsoft.com/office/drawing/2016/5/9/chartex" xmlns:cx4="http://schemas.microsoft.com/office/drawing/2016/5/10/chartex" xmlns:cx5="http://schemas.microsoft.com/office/drawing/2016/5/11/chartex" xmlns:cx6="http://schemas.microsoft.com/office/drawing/2016/5/12/chartex" xmlns:cx7="http://schemas.microsoft.com/office/drawing/2016/5/13/chartex" xmlns:cx8="http://schemas.microsoft.com/office/drawing/2016/5/14/chartex" xmlns:mc="http://schemas.openxmlformats.org/markup-compatibility/2006" xmlns:aink="http://schemas.microsoft.com/office/drawing/2016/ink" xmlns:am3d="http://schemas.microsoft.com/office/drawing/2017/model3d" xmlns:o="urn:schemas-microsoft-com:office:office" xmlns:oel="http://schemas.microsoft.com/office/2019/extlst" xmlns:r="http://schemas.openxmlformats.org/officeDocument/2006/relationships" xmlns:m="http://schemas.openxmlformats.org/officeDocument/2006/math" xmlns:v="urn:schemas-microsoft-com:vml" xmlns:wp14="http://schemas.microsoft.com/office/word/2010/wordprocessingDrawing" xmlns:wp="http://schemas.openxmlformats.org/drawingml/2006/wordprocessingDrawing" xmlns:w10="urn:schemas-microsoft-com:office:word" xmlns:w="http://schemas.openxmlformats.org/wordprocessingml/2006/main" xmlns:w14="http://schemas.microsoft.com/office/word/2010/wordml" xmlns:w15="http://schemas.microsoft.com/office/word/2012/wordml" xmlns:w16cex="http://schemas.microsoft.com/office/word/2018/wordml/cex" xmlns:w16cid="http://schemas.microsoft.com/office/word/2016/wordml/cid" xmlns:w16="http://schemas.microsoft.com/office/word/2018/wordml" xmlns:w16du="http://schemas.microsoft.com/office/word/2023/wordml/word16du" xmlns:w16sdtdh="http://schemas.microsoft.com/office/word/2020/wordml/sdtdatahash" xmlns:w16sdtfl="http://schemas.microsoft.com/office/word/2024/wordml/sdtformatlock" xmlns:w16se="http://schemas.microsoft.com/office/word/2015/wordml/symex" xmlns:wpg="http://schemas.microsoft.com/office/word/2010/wordprocessingGroup" xmlns:wpi="http://schemas.microsoft.com/office/word/2010/wordprocessingInk" xmlns:wne="http://schemas.microsoft.com/office/word/2006/wordml" xmlns:wps="http://schemas.microsoft.com/office/word/2010/wordprocessingShape" mc:Ignorable="w14 w15 w16se w16cid w16 w16cex w16sdtdh w16sdtfl w16du wp14">
+<w:footnotes xmlns:wpc="http://schemas.microsoft.com/office/word/2010/wordprocessingCanvas" xmlns:cx="http://schemas.microsoft.com/office/drawing/2014/chartex" xmlns:cx1="http://schemas.microsoft.com/office/drawing/2015/9/8/chartex" xmlns:cx2="http://schemas.microsoft.com/office/drawing/2015/10/21/chartex" xmlns:cx3="http://schemas.microsoft.com/office/drawing/2016/5/9/chartex" xmlns:cx4="http://schemas.microsoft.com/office/drawing/2016/5/10/chartex" xmlns:cx5="http://schemas.microsoft.com/office/drawing/2016/5/11/chartex" xmlns:cx6="http://schemas.microsoft.com/office/drawing/2016/5/12/chartex" xmlns:cx7="http://schemas.microsoft.com/office/drawing/2016/5/13/chartex" xmlns:cx8="http://schemas.microsoft.com/office/drawing/2016/5/14/chartex" xmlns:mc="http://schemas.openxmlformats.org/markup-compatibility/2006" xmlns:m="http://schemas.openxmlformats.org/officeDocument/2006/math" xmlns:aink="http://schemas.microsoft.com/office/drawing/2016/ink" xmlns:am3d="http://schemas.microsoft.com/office/drawing/2017/model3d" xmlns:oel="http://schemas.microsoft.com/office/2019/extlst" xmlns:r="http://schemas.openxmlformats.org/officeDocument/2006/relationships" xmlns:wp14="http://schemas.microsoft.com/office/word/2010/wordprocessingDrawing" xmlns:wp="http://schemas.openxmlformats.org/drawingml/2006/wordprocessingDrawing" xmlns:wpg="http://schemas.microsoft.com/office/word/2010/wordprocessingGroup" xmlns:wpi="http://schemas.microsoft.com/office/word/2010/wordprocessingInk" xmlns:wps="http://schemas.microsoft.com/office/word/2010/wordprocessingShape" xmlns:o="urn:schemas-microsoft-com:office:office" xmlns:v="urn:schemas-microsoft-com:vml" xmlns:w10="urn:schemas-microsoft-com:office:word" xmlns:w="http://schemas.openxmlformats.org/wordprocessingml/2006/main" xmlns:w14="http://schemas.microsoft.com/office/word/2010/wordml" xmlns:w15="http://schemas.microsoft.com/office/word/2012/wordml" xmlns:w16cei="http://schemas.microsoft.com/office/word/2026/wordml/cei" xmlns:w16cex="http://schemas.microsoft.com/office/word/2018/wordml/cex" xmlns:w16cid="http://schemas.microsoft.com/office/word/2016/wordml/cid" xmlns:w16="http://schemas.microsoft.com/office/word/2018/wordml" xmlns:w16sdtdh="http://schemas.microsoft.com/office/word/2020/wordml/sdtdatahash" xmlns:w16sdtfl="http://schemas.microsoft.com/office/word/2024/wordml/sdtformatlock" xmlns:w16se="http://schemas.microsoft.com/office/word/2015/wordml/symex" xmlns:w16du="http://schemas.microsoft.com/office/word/2023/wordml/word16du" xmlns:wne="http://schemas.microsoft.com/office/word/2006/wordml" mc:Ignorable="w14 w15 w16se w16cid w16 w16cex w16sdtdh w16sdtfl w16du wp14">
   <w:footnote w:type="separator" w:id="-1">
     <w:p>
       <w:r>
@@ -6289,7 +5996,7 @@
 </file>
 
 <file path=word/header1.xml><?xml version="1.0" encoding="utf-8"?>
-<w:hdr xmlns:wpc="http://schemas.microsoft.com/office/word/2010/wordprocessingCanvas" xmlns:cx="http://schemas.microsoft.com/office/drawing/2014/chartex" xmlns:cx1="http://schemas.microsoft.com/office/drawing/2015/9/8/chartex" xmlns:cx2="http://schemas.microsoft.com/office/drawing/2015/10/21/chartex" xmlns:cx3="http://schemas.microsoft.com/office/drawing/2016/5/9/chartex" xmlns:cx4="http://schemas.microsoft.com/office/drawing/2016/5/10/chartex" xmlns:cx5="http://schemas.microsoft.com/office/drawing/2016/5/11/chartex" xmlns:cx6="http://schemas.microsoft.com/office/drawing/2016/5/12/chartex" xmlns:cx7="http://schemas.microsoft.com/office/drawing/2016/5/13/chartex" xmlns:cx8="http://schemas.microsoft.com/office/drawing/2016/5/14/chartex" xmlns:mc="http://schemas.openxmlformats.org/markup-compatibility/2006" xmlns:aink="http://schemas.microsoft.com/office/drawing/2016/ink" xmlns:am3d="http://schemas.microsoft.com/office/drawing/2017/model3d" xmlns:o="urn:schemas-microsoft-com:office:office" xmlns:oel="http://schemas.microsoft.com/office/2019/extlst" xmlns:r="http://schemas.openxmlformats.org/officeDocument/2006/relationships" xmlns:m="http://schemas.openxmlformats.org/officeDocument/2006/math" xmlns:v="urn:schemas-microsoft-com:vml" xmlns:wp14="http://schemas.microsoft.com/office/word/2010/wordprocessingDrawing" xmlns:wp="http://schemas.openxmlformats.org/drawingml/2006/wordprocessingDrawing" xmlns:w10="urn:schemas-microsoft-com:office:word" xmlns:w="http://schemas.openxmlformats.org/wordprocessingml/2006/main" xmlns:w14="http://schemas.microsoft.com/office/word/2010/wordml" xmlns:w15="http://schemas.microsoft.com/office/word/2012/wordml" xmlns:w16cex="http://schemas.microsoft.com/office/word/2018/wordml/cex" xmlns:w16cid="http://schemas.microsoft.com/office/word/2016/wordml/cid" xmlns:w16="http://schemas.microsoft.com/office/word/2018/wordml" xmlns:w16du="http://schemas.microsoft.com/office/word/2023/wordml/word16du" xmlns:w16sdtdh="http://schemas.microsoft.com/office/word/2020/wordml/sdtdatahash" xmlns:w16sdtfl="http://schemas.microsoft.com/office/word/2024/wordml/sdtformatlock" xmlns:w16se="http://schemas.microsoft.com/office/word/2015/wordml/symex" xmlns:wpg="http://schemas.microsoft.com/office/word/2010/wordprocessingGroup" xmlns:wpi="http://schemas.microsoft.com/office/word/2010/wordprocessingInk" xmlns:wne="http://schemas.microsoft.com/office/word/2006/wordml" xmlns:wps="http://schemas.microsoft.com/office/word/2010/wordprocessingShape" mc:Ignorable="w14 w15 w16se w16cid w16 w16cex w16sdtdh w16sdtfl w16du wp14">
+<w:hdr xmlns:wpc="http://schemas.microsoft.com/office/word/2010/wordprocessingCanvas" xmlns:cx="http://schemas.microsoft.com/office/drawing/2014/chartex" xmlns:cx1="http://schemas.microsoft.com/office/drawing/2015/9/8/chartex" xmlns:cx2="http://schemas.microsoft.com/office/drawing/2015/10/21/chartex" xmlns:cx3="http://schemas.microsoft.com/office/drawing/2016/5/9/chartex" xmlns:cx4="http://schemas.microsoft.com/office/drawing/2016/5/10/chartex" xmlns:cx5="http://schemas.microsoft.com/office/drawing/2016/5/11/chartex" xmlns:cx6="http://schemas.microsoft.com/office/drawing/2016/5/12/chartex" xmlns:cx7="http://schemas.microsoft.com/office/drawing/2016/5/13/chartex" xmlns:cx8="http://schemas.microsoft.com/office/drawing/2016/5/14/chartex" xmlns:mc="http://schemas.openxmlformats.org/markup-compatibility/2006" xmlns:m="http://schemas.openxmlformats.org/officeDocument/2006/math" xmlns:aink="http://schemas.microsoft.com/office/drawing/2016/ink" xmlns:am3d="http://schemas.microsoft.com/office/drawing/2017/model3d" xmlns:oel="http://schemas.microsoft.com/office/2019/extlst" xmlns:r="http://schemas.openxmlformats.org/officeDocument/2006/relationships" xmlns:wp14="http://schemas.microsoft.com/office/word/2010/wordprocessingDrawing" xmlns:wp="http://schemas.openxmlformats.org/drawingml/2006/wordprocessingDrawing" xmlns:wpg="http://schemas.microsoft.com/office/word/2010/wordprocessingGroup" xmlns:wpi="http://schemas.microsoft.com/office/word/2010/wordprocessingInk" xmlns:wps="http://schemas.microsoft.com/office/word/2010/wordprocessingShape" xmlns:o="urn:schemas-microsoft-com:office:office" xmlns:v="urn:schemas-microsoft-com:vml" xmlns:w10="urn:schemas-microsoft-com:office:word" xmlns:w="http://schemas.openxmlformats.org/wordprocessingml/2006/main" xmlns:w14="http://schemas.microsoft.com/office/word/2010/wordml" xmlns:w15="http://schemas.microsoft.com/office/word/2012/wordml" xmlns:w16cei="http://schemas.microsoft.com/office/word/2026/wordml/cei" xmlns:w16cex="http://schemas.microsoft.com/office/word/2018/wordml/cex" xmlns:w16cid="http://schemas.microsoft.com/office/word/2016/wordml/cid" xmlns:w16="http://schemas.microsoft.com/office/word/2018/wordml" xmlns:w16sdtdh="http://schemas.microsoft.com/office/word/2020/wordml/sdtdatahash" xmlns:w16sdtfl="http://schemas.microsoft.com/office/word/2024/wordml/sdtformatlock" xmlns:w16se="http://schemas.microsoft.com/office/word/2015/wordml/symex" xmlns:w16du="http://schemas.microsoft.com/office/word/2023/wordml/word16du" xmlns:wne="http://schemas.microsoft.com/office/word/2006/wordml" mc:Ignorable="w14 w15 w16se w16cid w16 w16cex w16sdtdh w16sdtfl w16du wp14">
   <w:sdt>
     <w:sdtPr>
       <w:rPr>
@@ -6340,7 +6047,7 @@
 </file>
 
 <file path=word/header2.xml><?xml version="1.0" encoding="utf-8"?>
-<w:hdr xmlns:wpc="http://schemas.microsoft.com/office/word/2010/wordprocessingCanvas" xmlns:cx="http://schemas.microsoft.com/office/drawing/2014/chartex" xmlns:cx1="http://schemas.microsoft.com/office/drawing/2015/9/8/chartex" xmlns:cx2="http://schemas.microsoft.com/office/drawing/2015/10/21/chartex" xmlns:cx3="http://schemas.microsoft.com/office/drawing/2016/5/9/chartex" xmlns:cx4="http://schemas.microsoft.com/office/drawing/2016/5/10/chartex" xmlns:cx5="http://schemas.microsoft.com/office/drawing/2016/5/11/chartex" xmlns:cx6="http://schemas.microsoft.com/office/drawing/2016/5/12/chartex" xmlns:cx7="http://schemas.microsoft.com/office/drawing/2016/5/13/chartex" xmlns:cx8="http://schemas.microsoft.com/office/drawing/2016/5/14/chartex" xmlns:mc="http://schemas.openxmlformats.org/markup-compatibility/2006" xmlns:aink="http://schemas.microsoft.com/office/drawing/2016/ink" xmlns:am3d="http://schemas.microsoft.com/office/drawing/2017/model3d" xmlns:o="urn:schemas-microsoft-com:office:office" xmlns:oel="http://schemas.microsoft.com/office/2019/extlst" xmlns:r="http://schemas.openxmlformats.org/officeDocument/2006/relationships" xmlns:m="http://schemas.openxmlformats.org/officeDocument/2006/math" xmlns:v="urn:schemas-microsoft-com:vml" xmlns:wp14="http://schemas.microsoft.com/office/word/2010/wordprocessingDrawing" xmlns:wp="http://schemas.openxmlformats.org/drawingml/2006/wordprocessingDrawing" xmlns:w10="urn:schemas-microsoft-com:office:word" xmlns:w="http://schemas.openxmlformats.org/wordprocessingml/2006/main" xmlns:w14="http://schemas.microsoft.com/office/word/2010/wordml" xmlns:w15="http://schemas.microsoft.com/office/word/2012/wordml" xmlns:w16cex="http://schemas.microsoft.com/office/word/2018/wordml/cex" xmlns:w16cid="http://schemas.microsoft.com/office/word/2016/wordml/cid" xmlns:w16="http://schemas.microsoft.com/office/word/2018/wordml" xmlns:w16du="http://schemas.microsoft.com/office/word/2023/wordml/word16du" xmlns:w16sdtdh="http://schemas.microsoft.com/office/word/2020/wordml/sdtdatahash" xmlns:w16sdtfl="http://schemas.microsoft.com/office/word/2024/wordml/sdtformatlock" xmlns:w16se="http://schemas.microsoft.com/office/word/2015/wordml/symex" xmlns:wpg="http://schemas.microsoft.com/office/word/2010/wordprocessingGroup" xmlns:wpi="http://schemas.microsoft.com/office/word/2010/wordprocessingInk" xmlns:wne="http://schemas.microsoft.com/office/word/2006/wordml" xmlns:wps="http://schemas.microsoft.com/office/word/2010/wordprocessingShape" mc:Ignorable="w14 w15 w16se w16cid w16 w16cex w16sdtdh w16sdtfl w16du wp14">
+<w:hdr xmlns:wpc="http://schemas.microsoft.com/office/word/2010/wordprocessingCanvas" xmlns:cx="http://schemas.microsoft.com/office/drawing/2014/chartex" xmlns:cx1="http://schemas.microsoft.com/office/drawing/2015/9/8/chartex" xmlns:cx2="http://schemas.microsoft.com/office/drawing/2015/10/21/chartex" xmlns:cx3="http://schemas.microsoft.com/office/drawing/2016/5/9/chartex" xmlns:cx4="http://schemas.microsoft.com/office/drawing/2016/5/10/chartex" xmlns:cx5="http://schemas.microsoft.com/office/drawing/2016/5/11/chartex" xmlns:cx6="http://schemas.microsoft.com/office/drawing/2016/5/12/chartex" xmlns:cx7="http://schemas.microsoft.com/office/drawing/2016/5/13/chartex" xmlns:cx8="http://schemas.microsoft.com/office/drawing/2016/5/14/chartex" xmlns:mc="http://schemas.openxmlformats.org/markup-compatibility/2006" xmlns:m="http://schemas.openxmlformats.org/officeDocument/2006/math" xmlns:aink="http://schemas.microsoft.com/office/drawing/2016/ink" xmlns:am3d="http://schemas.microsoft.com/office/drawing/2017/model3d" xmlns:oel="http://schemas.microsoft.com/office/2019/extlst" xmlns:r="http://schemas.openxmlformats.org/officeDocument/2006/relationships" xmlns:wp14="http://schemas.microsoft.com/office/word/2010/wordprocessingDrawing" xmlns:wp="http://schemas.openxmlformats.org/drawingml/2006/wordprocessingDrawing" xmlns:wpg="http://schemas.microsoft.com/office/word/2010/wordprocessingGroup" xmlns:wpi="http://schemas.microsoft.com/office/word/2010/wordprocessingInk" xmlns:wps="http://schemas.microsoft.com/office/word/2010/wordprocessingShape" xmlns:o="urn:schemas-microsoft-com:office:office" xmlns:v="urn:schemas-microsoft-com:vml" xmlns:w10="urn:schemas-microsoft-com:office:word" xmlns:w="http://schemas.openxmlformats.org/wordprocessingml/2006/main" xmlns:w14="http://schemas.microsoft.com/office/word/2010/wordml" xmlns:w15="http://schemas.microsoft.com/office/word/2012/wordml" xmlns:w16cei="http://schemas.microsoft.com/office/word/2026/wordml/cei" xmlns:w16cex="http://schemas.microsoft.com/office/word/2018/wordml/cex" xmlns:w16cid="http://schemas.microsoft.com/office/word/2016/wordml/cid" xmlns:w16="http://schemas.microsoft.com/office/word/2018/wordml" xmlns:w16sdtdh="http://schemas.microsoft.com/office/word/2020/wordml/sdtdatahash" xmlns:w16sdtfl="http://schemas.microsoft.com/office/word/2024/wordml/sdtformatlock" xmlns:w16se="http://schemas.microsoft.com/office/word/2015/wordml/symex" xmlns:w16du="http://schemas.microsoft.com/office/word/2023/wordml/word16du" xmlns:wne="http://schemas.microsoft.com/office/word/2006/wordml" mc:Ignorable="w14 w15 w16se w16cid w16 w16cex w16sdtdh w16sdtfl w16du wp14">
   <w:sdt>
     <w:sdtPr>
       <w:rPr>
@@ -6404,7 +6111,7 @@
 </file>
 
 <file path=word/numbering.xml><?xml version="1.0" encoding="utf-8"?>
-<w:numbering xmlns:wpc="http://schemas.microsoft.com/office/word/2010/wordprocessingCanvas" xmlns:cx="http://schemas.microsoft.com/office/drawing/2014/chartex" xmlns:cx1="http://schemas.microsoft.com/office/drawing/2015/9/8/chartex" xmlns:cx2="http://schemas.microsoft.com/office/drawing/2015/10/21/chartex" xmlns:cx3="http://schemas.microsoft.com/office/drawing/2016/5/9/chartex" xmlns:cx4="http://schemas.microsoft.com/office/drawing/2016/5/10/chartex" xmlns:cx5="http://schemas.microsoft.com/office/drawing/2016/5/11/chartex" xmlns:cx6="http://schemas.microsoft.com/office/drawing/2016/5/12/chartex" xmlns:cx7="http://schemas.microsoft.com/office/drawing/2016/5/13/chartex" xmlns:cx8="http://schemas.microsoft.com/office/drawing/2016/5/14/chartex" xmlns:mc="http://schemas.openxmlformats.org/markup-compatibility/2006" xmlns:aink="http://schemas.microsoft.com/office/drawing/2016/ink" xmlns:am3d="http://schemas.microsoft.com/office/drawing/2017/model3d" xmlns:o="urn:schemas-microsoft-com:office:office" xmlns:oel="http://schemas.microsoft.com/office/2019/extlst" xmlns:r="http://schemas.openxmlformats.org/officeDocument/2006/relationships" xmlns:m="http://schemas.openxmlformats.org/officeDocument/2006/math" xmlns:v="urn:schemas-microsoft-com:vml" xmlns:wp14="http://schemas.microsoft.com/office/word/2010/wordprocessingDrawing" xmlns:wp="http://schemas.openxmlformats.org/drawingml/2006/wordprocessingDrawing" xmlns:w10="urn:schemas-microsoft-com:office:word" xmlns:w="http://schemas.openxmlformats.org/wordprocessingml/2006/main" xmlns:w14="http://schemas.microsoft.com/office/word/2010/wordml" xmlns:w15="http://schemas.microsoft.com/office/word/2012/wordml" xmlns:w16cex="http://schemas.microsoft.com/office/word/2018/wordml/cex" xmlns:w16cid="http://schemas.microsoft.com/office/word/2016/wordml/cid" xmlns:w16="http://schemas.microsoft.com/office/word/2018/wordml" xmlns:w16du="http://schemas.microsoft.com/office/word/2023/wordml/word16du" xmlns:w16sdtdh="http://schemas.microsoft.com/office/word/2020/wordml/sdtdatahash" xmlns:w16sdtfl="http://schemas.microsoft.com/office/word/2024/wordml/sdtformatlock" xmlns:w16se="http://schemas.microsoft.com/office/word/2015/wordml/symex" xmlns:wpg="http://schemas.microsoft.com/office/word/2010/wordprocessingGroup" xmlns:wpi="http://schemas.microsoft.com/office/word/2010/wordprocessingInk" xmlns:wne="http://schemas.microsoft.com/office/word/2006/wordml" xmlns:wps="http://schemas.microsoft.com/office/word/2010/wordprocessingShape" mc:Ignorable="w14 w15 w16se w16cid w16 w16cex w16sdtdh w16sdtfl w16du wp14">
+<w:numbering xmlns:wpc="http://schemas.microsoft.com/office/word/2010/wordprocessingCanvas" xmlns:cx="http://schemas.microsoft.com/office/drawing/2014/chartex" xmlns:cx1="http://schemas.microsoft.com/office/drawing/2015/9/8/chartex" xmlns:cx2="http://schemas.microsoft.com/office/drawing/2015/10/21/chartex" xmlns:cx3="http://schemas.microsoft.com/office/drawing/2016/5/9/chartex" xmlns:cx4="http://schemas.microsoft.com/office/drawing/2016/5/10/chartex" xmlns:cx5="http://schemas.microsoft.com/office/drawing/2016/5/11/chartex" xmlns:cx6="http://schemas.microsoft.com/office/drawing/2016/5/12/chartex" xmlns:cx7="http://schemas.microsoft.com/office/drawing/2016/5/13/chartex" xmlns:cx8="http://schemas.microsoft.com/office/drawing/2016/5/14/chartex" xmlns:mc="http://schemas.openxmlformats.org/markup-compatibility/2006" xmlns:m="http://schemas.openxmlformats.org/officeDocument/2006/math" xmlns:aink="http://schemas.microsoft.com/office/drawing/2016/ink" xmlns:am3d="http://schemas.microsoft.com/office/drawing/2017/model3d" xmlns:oel="http://schemas.microsoft.com/office/2019/extlst" xmlns:r="http://schemas.openxmlformats.org/officeDocument/2006/relationships" xmlns:wp14="http://schemas.microsoft.com/office/word/2010/wordprocessingDrawing" xmlns:wp="http://schemas.openxmlformats.org/drawingml/2006/wordprocessingDrawing" xmlns:wpg="http://schemas.microsoft.com/office/word/2010/wordprocessingGroup" xmlns:wpi="http://schemas.microsoft.com/office/word/2010/wordprocessingInk" xmlns:wps="http://schemas.microsoft.com/office/word/2010/wordprocessingShape" xmlns:o="urn:schemas-microsoft-com:office:office" xmlns:v="urn:schemas-microsoft-com:vml" xmlns:w10="urn:schemas-microsoft-com:office:word" xmlns:w="http://schemas.openxmlformats.org/wordprocessingml/2006/main" xmlns:w14="http://schemas.microsoft.com/office/word/2010/wordml" xmlns:w15="http://schemas.microsoft.com/office/word/2012/wordml" xmlns:w16cei="http://schemas.microsoft.com/office/word/2026/wordml/cei" xmlns:w16cex="http://schemas.microsoft.com/office/word/2018/wordml/cex" xmlns:w16cid="http://schemas.microsoft.com/office/word/2016/wordml/cid" xmlns:w16="http://schemas.microsoft.com/office/word/2018/wordml" xmlns:w16sdtdh="http://schemas.microsoft.com/office/word/2020/wordml/sdtdatahash" xmlns:w16sdtfl="http://schemas.microsoft.com/office/word/2024/wordml/sdtformatlock" xmlns:w16se="http://schemas.microsoft.com/office/word/2015/wordml/symex" xmlns:w16du="http://schemas.microsoft.com/office/word/2023/wordml/word16du" xmlns:wne="http://schemas.microsoft.com/office/word/2006/wordml" mc:Ignorable="w14 w15 w16se w16cid w16 w16cex w16sdtdh w16sdtfl w16du wp14">
   <w:abstractNum w:abstractNumId="0" w15:restartNumberingAfterBreak="0">
     <w:nsid w:val="44DA2250"/>
     <w:multiLevelType w:val="hybridMultilevel"/>
@@ -6501,7 +6208,7 @@
 </file>
 
 <file path=word/styles.xml><?xml version="1.0" encoding="utf-8"?>
-<w:styles xmlns:mc="http://schemas.openxmlformats.org/markup-compatibility/2006" xmlns:r="http://schemas.openxmlformats.org/officeDocument/2006/relationships" xmlns:w="http://schemas.openxmlformats.org/wordprocessingml/2006/main" xmlns:w14="http://schemas.microsoft.com/office/word/2010/wordml" xmlns:w15="http://schemas.microsoft.com/office/word/2012/wordml" xmlns:w16cex="http://schemas.microsoft.com/office/word/2018/wordml/cex" xmlns:w16cid="http://schemas.microsoft.com/office/word/2016/wordml/cid" xmlns:w16="http://schemas.microsoft.com/office/word/2018/wordml" xmlns:w16du="http://schemas.microsoft.com/office/word/2023/wordml/word16du" xmlns:w16sdtdh="http://schemas.microsoft.com/office/word/2020/wordml/sdtdatahash" xmlns:w16sdtfl="http://schemas.microsoft.com/office/word/2024/wordml/sdtformatlock" xmlns:w16se="http://schemas.microsoft.com/office/word/2015/wordml/symex" mc:Ignorable="w14 w15 w16se w16cid w16 w16cex w16sdtdh w16sdtfl w16du">
+<w:styles xmlns:mc="http://schemas.openxmlformats.org/markup-compatibility/2006" xmlns:r="http://schemas.openxmlformats.org/officeDocument/2006/relationships" xmlns:w="http://schemas.openxmlformats.org/wordprocessingml/2006/main" xmlns:w14="http://schemas.microsoft.com/office/word/2010/wordml" xmlns:w15="http://schemas.microsoft.com/office/word/2012/wordml" xmlns:w16cex="http://schemas.microsoft.com/office/word/2018/wordml/cex" xmlns:w16cid="http://schemas.microsoft.com/office/word/2016/wordml/cid" xmlns:w16="http://schemas.microsoft.com/office/word/2018/wordml" xmlns:w16sdtdh="http://schemas.microsoft.com/office/word/2020/wordml/sdtdatahash" xmlns:w16sdtfl="http://schemas.microsoft.com/office/word/2024/wordml/sdtformatlock" xmlns:w16se="http://schemas.microsoft.com/office/word/2015/wordml/symex" xmlns:w16du="http://schemas.microsoft.com/office/word/2023/wordml/word16du" mc:Ignorable="w14 w15 w16se w16cid w16 w16cex w16sdtdh w16sdtfl w16du">
   <w:docDefaults>
     <w:rPrDefault>
       <w:rPr>

</xml_diff>